<commit_message>
Versión 1.1: Modificación de la lógica para el reporte de la tarde
</commit_message>
<xml_diff>
--- a/Trabajo Final_Herrera Llanos, Ariany.docx
+++ b/Trabajo Final_Herrera Llanos, Ariany.docx
@@ -9,6 +9,7 @@
           <w:ilvl w:val="0"/>
           <w:numId w:val="2"/>
         </w:numPr>
+        <w:jc w:val="both"/>
       </w:pPr>
       <w:proofErr w:type="gramStart"/>
       <w:r>
@@ -19,9 +20,10 @@
     <w:p>
       <w:pPr>
         <w:ind w:left="360"/>
-      </w:pPr>
-      <w:r>
-        <w:t xml:space="preserve">Actualmente, el pipeline de automatización en Jenkins para la empresa </w:t>
+        <w:jc w:val="both"/>
+      </w:pPr>
+      <w:r>
+        <w:t xml:space="preserve">La empresa </w:t>
       </w:r>
       <w:proofErr w:type="spellStart"/>
       <w:r>
@@ -29,49 +31,86 @@
       </w:r>
       <w:proofErr w:type="spellEnd"/>
       <w:r>
-        <w:t xml:space="preserve"> S.A.C. procesa reportes de manera continua</w:t>
+        <w:t xml:space="preserve"> S.A.C. es una empresa que se dedica al control financiero de varias empresas; es decir, ayudan a las empresas a auditar internamente el área financiera, contable y tesorería, verificando y controlando que las salidas y entradas de dinero de los bancos se encuentren justificadas y, evitar o encontrar movimientos inusuales.</w:t>
+      </w:r>
+    </w:p>
+    <w:p>
+      <w:pPr>
+        <w:ind w:left="360"/>
+        <w:jc w:val="both"/>
+      </w:pPr>
+      <w:r>
+        <w:t xml:space="preserve">Actualmente, </w:t>
+      </w:r>
+      <w:r>
+        <w:t>d</w:t>
+      </w:r>
+      <w:r>
+        <w:t>ebido a que manejan varios proyectos simultáneos y hay poco personal personalizado</w:t>
+      </w:r>
+      <w:r>
+        <w:t xml:space="preserve"> se implementó </w:t>
+      </w:r>
+      <w:r>
+        <w:t xml:space="preserve">el pipeline de automatización en Jenkins para la empresa </w:t>
+      </w:r>
+      <w:proofErr w:type="spellStart"/>
+      <w:r>
+        <w:t>ControlFin</w:t>
+      </w:r>
+      <w:proofErr w:type="spellEnd"/>
+      <w:r>
+        <w:t xml:space="preserve"> S.A.C.</w:t>
+      </w:r>
+      <w:r>
+        <w:t>, que</w:t>
+      </w:r>
+      <w:r>
+        <w:t xml:space="preserve"> procesa reportes de manera continua</w:t>
       </w:r>
       <w:r>
         <w:t xml:space="preserve">. Sin embargo, el código actual </w:t>
       </w:r>
+      <w:r>
+        <w:t>sobrescribe</w:t>
+      </w:r>
+      <w:r>
+        <w:t xml:space="preserve"> la versión, </w:t>
+      </w:r>
+      <w:r>
+        <w:t>y no se puede saber durante el día que versión es la final</w:t>
+      </w:r>
+      <w:r>
+        <w:t xml:space="preserve">. Si el reporte o su código se actualizan en diferentes horas del mismo día </w:t>
+      </w:r>
+      <w:r>
+        <w:t>y surge un error en la última actualización, no podremos saber cuál es la causa del error</w:t>
+      </w:r>
+      <w:r>
+        <w:t>,</w:t>
+      </w:r>
+      <w:r>
+        <w:t xml:space="preserve"> quien lo </w:t>
+      </w:r>
+      <w:r>
+        <w:t xml:space="preserve">hizo y tener el </w:t>
+      </w:r>
       <w:proofErr w:type="spellStart"/>
       <w:r>
-        <w:t>sobreescribe</w:t>
+        <w:t>backup</w:t>
+      </w:r>
+      <w:r>
+        <w:t>s</w:t>
       </w:r>
       <w:proofErr w:type="spellEnd"/>
       <w:r>
-        <w:t xml:space="preserve"> la versión, </w:t>
-      </w:r>
-      <w:r>
-        <w:t>y no se puede saber durante el día que versión es la final</w:t>
-      </w:r>
-      <w:r>
-        <w:t xml:space="preserve">. Si el reporte o su código se actualizan en diferentes horas del mismo día </w:t>
-      </w:r>
-      <w:r>
-        <w:t>y surge un error en la última actualización, no podremos saber cuál es la causa del error</w:t>
-      </w:r>
-      <w:r>
-        <w:t>,</w:t>
-      </w:r>
-      <w:r>
-        <w:t xml:space="preserve"> quien lo </w:t>
-      </w:r>
-      <w:r>
-        <w:t xml:space="preserve">hizo y tener </w:t>
-      </w:r>
-      <w:proofErr w:type="gramStart"/>
-      <w:r>
-        <w:t xml:space="preserve">el </w:t>
-      </w:r>
-      <w:proofErr w:type="spellStart"/>
-      <w:r>
-        <w:t>backup</w:t>
-      </w:r>
-      <w:proofErr w:type="spellEnd"/>
-      <w:proofErr w:type="gramEnd"/>
-      <w:r>
-        <w:t xml:space="preserve"> de la ultima versión del código que sí funcionaba</w:t>
+        <w:t xml:space="preserve"> de la </w:t>
+      </w:r>
+      <w:r>
+        <w:t>última</w:t>
+      </w:r>
+      <w:r>
+        <w:t xml:space="preserve"> versión del código que sí funcionaba</w:t>
       </w:r>
       <w:r>
         <w:t>.</w:t>
@@ -87,9 +126,17 @@
           <w:ilvl w:val="1"/>
           <w:numId w:val="2"/>
         </w:numPr>
-      </w:pPr>
-      <w:r>
-        <w:t>Falta de historial de archivos: si un miembro del equipo modifica el archivo del modelo por un actualizado o del pipeline y guarda los cambios, se actualizaba encima del archivo ya guardado, ocasionando que se pierda permanentemente. No se podía saber tampoco quien hizo el cambio.</w:t>
+        <w:jc w:val="both"/>
+      </w:pPr>
+      <w:r>
+        <w:rPr>
+          <w:b/>
+          <w:bCs/>
+        </w:rPr>
+        <w:t>Falta de historial de archivos</w:t>
+      </w:r>
+      <w:r>
+        <w:t>: si un miembro del equipo modifica el archivo del modelo por un actualizado o del pipeline y guarda los cambios, se actualizaba encima del archivo ya guardado, ocasionando que se pierda permanentemente. No se podía saber tampoco quien hizo el cambio.</w:t>
       </w:r>
     </w:p>
     <w:p>
@@ -99,9 +146,17 @@
           <w:ilvl w:val="1"/>
           <w:numId w:val="2"/>
         </w:numPr>
-      </w:pPr>
-      <w:r>
-        <w:t>Archivos duplicados y caos de versiones: Si el equipo quiere guardar la versión anterior, se tiene que cambiar el nombre manualmente lo cual podría generar una confusión por saber la versión</w:t>
+        <w:jc w:val="both"/>
+      </w:pPr>
+      <w:r>
+        <w:rPr>
+          <w:b/>
+          <w:bCs/>
+        </w:rPr>
+        <w:t>Archivos duplicados y caos de versiones</w:t>
+      </w:r>
+      <w:r>
+        <w:t>: Si el equipo quiere guardar la versión anterior, se tiene que cambiar el nombre manualmente lo cual podría generar una confusión por saber la versión</w:t>
       </w:r>
       <w:r>
         <w:t xml:space="preserve"> actual</w:t>
@@ -117,15 +172,31 @@
           <w:ilvl w:val="1"/>
           <w:numId w:val="2"/>
         </w:numPr>
-      </w:pPr>
-      <w:r>
+        <w:jc w:val="both"/>
+      </w:pPr>
+      <w:r>
+        <w:rPr>
+          <w:b/>
+          <w:bCs/>
+        </w:rPr>
         <w:t xml:space="preserve">Problemas en </w:t>
       </w:r>
       <w:r>
+        <w:rPr>
+          <w:b/>
+          <w:bCs/>
+        </w:rPr>
         <w:t>sobreescritura</w:t>
       </w:r>
       <w:r>
-        <w:t xml:space="preserve"> en el pipeline: si </w:t>
+        <w:rPr>
+          <w:b/>
+          <w:bCs/>
+        </w:rPr>
+        <w:t xml:space="preserve"> en el pipeline</w:t>
+      </w:r>
+      <w:r>
+        <w:t xml:space="preserve">: si </w:t>
       </w:r>
       <w:r>
         <w:t>dos integrantes del equipo están</w:t>
@@ -133,6 +204,14 @@
       <w:r>
         <w:t xml:space="preserve"> en Jenkins modificando el mismo código, las modificaciones se sobrescriben y malogra la automatización</w:t>
       </w:r>
+      <w:r>
+        <w:t>.</w:t>
+      </w:r>
+    </w:p>
+    <w:p>
+      <w:pPr>
+        <w:jc w:val="both"/>
+      </w:pPr>
     </w:p>
     <w:p>
       <w:pPr>
@@ -141,6 +220,7 @@
           <w:ilvl w:val="0"/>
           <w:numId w:val="2"/>
         </w:numPr>
+        <w:jc w:val="both"/>
       </w:pPr>
       <w:r>
         <w:t xml:space="preserve">Beneficios de </w:t>
@@ -170,9 +250,17 @@
           <w:ilvl w:val="1"/>
           <w:numId w:val="2"/>
         </w:numPr>
-      </w:pPr>
-      <w:r>
-        <w:t xml:space="preserve">Auditoría: Git nos ayudará a </w:t>
+        <w:jc w:val="both"/>
+      </w:pPr>
+      <w:r>
+        <w:rPr>
+          <w:b/>
+          <w:bCs/>
+        </w:rPr>
+        <w:t>Auditoría</w:t>
+      </w:r>
+      <w:r>
+        <w:t xml:space="preserve">: Git nos ayudará a </w:t>
       </w:r>
       <w:r>
         <w:t>que,</w:t>
@@ -188,15 +276,38 @@
           <w:ilvl w:val="1"/>
           <w:numId w:val="2"/>
         </w:numPr>
-      </w:pPr>
-      <w:r>
-        <w:t xml:space="preserve">Eliminación de duplicados: GitHub ayudará a que el equipo </w:t>
-      </w:r>
-      <w:r>
-        <w:t>sepa cual es la versión oficial mas</w:t>
-      </w:r>
-      <w:r>
-        <w:t xml:space="preserve"> reciente que se encuentre en la nube.</w:t>
+        <w:jc w:val="both"/>
+      </w:pPr>
+      <w:r>
+        <w:rPr>
+          <w:b/>
+          <w:bCs/>
+        </w:rPr>
+        <w:t>Eliminación de duplicados</w:t>
+      </w:r>
+      <w:r>
+        <w:t xml:space="preserve">: GitHub ayudará a que el equipo </w:t>
+      </w:r>
+      <w:r>
+        <w:t xml:space="preserve">sepa cual es la versión oficial </w:t>
+      </w:r>
+      <w:r>
+        <w:t>más</w:t>
+      </w:r>
+      <w:r>
+        <w:t xml:space="preserve"> reciente que se encuentre en la nube</w:t>
+      </w:r>
+      <w:r>
+        <w:t xml:space="preserve">, eliminando </w:t>
+      </w:r>
+      <w:r>
+        <w:t xml:space="preserve">la necesidad de renombrar manualmente para conservar </w:t>
+      </w:r>
+      <w:r>
+        <w:t>versiones anteriores</w:t>
+      </w:r>
+      <w:r>
+        <w:t>.</w:t>
       </w:r>
     </w:p>
     <w:p>
@@ -206,12 +317,44 @@
           <w:ilvl w:val="1"/>
           <w:numId w:val="2"/>
         </w:numPr>
-      </w:pPr>
+        <w:jc w:val="both"/>
+      </w:pPr>
+      <w:r>
+        <w:rPr>
+          <w:b/>
+          <w:bCs/>
+        </w:rPr>
+        <w:t>Recuperación ante errores</w:t>
+      </w:r>
+      <w:r>
+        <w:t>:</w:t>
+      </w:r>
       <w:r>
         <w:t xml:space="preserve"> </w:t>
       </w:r>
       <w:r>
-        <w:t xml:space="preserve">Trabajo colaborativo: </w:t>
+        <w:t>Como cuenta con historial de versiones, se podrá saber cuándo fue la última versión que funcionaba de forma correcta.</w:t>
+      </w:r>
+    </w:p>
+    <w:p>
+      <w:pPr>
+        <w:pStyle w:val="Prrafodelista"/>
+        <w:numPr>
+          <w:ilvl w:val="1"/>
+          <w:numId w:val="2"/>
+        </w:numPr>
+        <w:jc w:val="both"/>
+      </w:pPr>
+      <w:r>
+        <w:rPr>
+          <w:b/>
+          <w:bCs/>
+        </w:rPr>
+        <w:lastRenderedPageBreak/>
+        <w:t>Trabajo colaborativo</w:t>
+      </w:r>
+      <w:r>
+        <w:t xml:space="preserve">: </w:t>
       </w:r>
       <w:r>
         <w:t>Permitirá</w:t>
@@ -219,33 +362,38 @@
       <w:r>
         <w:t xml:space="preserve"> </w:t>
       </w:r>
-      <w:proofErr w:type="gramStart"/>
-      <w:r>
-        <w:t>que</w:t>
-      </w:r>
-      <w:proofErr w:type="gramEnd"/>
-      <w:r>
-        <w:t xml:space="preserve"> si 2 personas realizan cambios de manera independiente, </w:t>
-      </w:r>
-      <w:r>
-        <w:t xml:space="preserve">por ejemplo, si un integrante desea actualizar la hora del </w:t>
-      </w:r>
-      <w:r>
-        <w:t>reporte de los movimientos del Citibank</w:t>
-      </w:r>
-      <w:r>
-        <w:t xml:space="preserve">, ya que el ultimo reporte fue a las </w:t>
-      </w:r>
-      <w:proofErr w:type="gramStart"/>
-      <w:r>
-        <w:t>10am</w:t>
-      </w:r>
-      <w:proofErr w:type="gramEnd"/>
-      <w:r>
-        <w:t xml:space="preserve"> pero desea </w:t>
-      </w:r>
-      <w:r>
-        <w:t>actualizar para las 12pm</w:t>
+      <w:r>
+        <w:t>que,</w:t>
+      </w:r>
+      <w:r>
+        <w:t xml:space="preserve"> si 2 personas realizan cambios de manera independiente</w:t>
+      </w:r>
+      <w:r>
+        <w:t>, se pueda unir ambos aportes de manera limpia.</w:t>
+      </w:r>
+    </w:p>
+    <w:p>
+      <w:pPr>
+        <w:ind w:left="360"/>
+        <w:jc w:val="both"/>
+      </w:pPr>
+      <w:r>
+        <w:t xml:space="preserve">Con este proceso </w:t>
+      </w:r>
+      <w:r>
+        <w:t xml:space="preserve">se elimina el riesgo operativo </w:t>
+      </w:r>
+      <w:r>
+        <w:t>asociado al copiado y pegado m</w:t>
+      </w:r>
+      <w:r>
+        <w:t xml:space="preserve">anual, </w:t>
+      </w:r>
+      <w:r>
+        <w:t xml:space="preserve">con esto se disminuye </w:t>
+      </w:r>
+      <w:r>
+        <w:t xml:space="preserve">1 hora diaria por analista. </w:t>
       </w:r>
     </w:p>
     <w:p>
@@ -255,10 +403,246 @@
           <w:ilvl w:val="0"/>
           <w:numId w:val="2"/>
         </w:numPr>
+        <w:jc w:val="both"/>
       </w:pPr>
       <w:r>
         <w:t>Creación del repositorio</w:t>
       </w:r>
+    </w:p>
+    <w:p>
+      <w:pPr>
+        <w:ind w:left="360"/>
+        <w:jc w:val="both"/>
+      </w:pPr>
+      <w:r>
+        <w:t xml:space="preserve">Para ver el código del pipeline de </w:t>
+      </w:r>
+      <w:proofErr w:type="spellStart"/>
+      <w:r>
+        <w:t>ControlFin</w:t>
+      </w:r>
+      <w:proofErr w:type="spellEnd"/>
+      <w:r>
+        <w:t xml:space="preserve"> S.A.C en la nube y </w:t>
+      </w:r>
+      <w:r>
+        <w:t>que permita el acceso como colaboración de los integrantes del equipo</w:t>
+      </w:r>
+      <w:r>
+        <w:t>, se creó un repositorio público en GitHub con nombre “</w:t>
+      </w:r>
+      <w:proofErr w:type="spellStart"/>
+      <w:r>
+        <w:t>Controlfin</w:t>
+      </w:r>
+      <w:proofErr w:type="spellEnd"/>
+      <w:r>
+        <w:t>-SAC”</w:t>
+      </w:r>
+      <w:r>
+        <w:t xml:space="preserve">. Este repositorio guarda los archivos que necesita el pipeline para lograr completar </w:t>
+      </w:r>
+      <w:r>
+        <w:t>todo el proceso.</w:t>
+      </w:r>
+      <w:r>
+        <w:t xml:space="preserve"> </w:t>
+      </w:r>
+    </w:p>
+    <w:p>
+      <w:pPr>
+        <w:ind w:left="360"/>
+        <w:jc w:val="both"/>
+      </w:pPr>
+      <w:r>
+        <w:t xml:space="preserve">Usando Git Bash </w:t>
+      </w:r>
+      <w:r>
+        <w:rPr>
+          <w:noProof/>
+        </w:rPr>
+        <w:drawing>
+          <wp:inline distT="0" distB="0" distL="0" distR="0" wp14:anchorId="6421F716" wp14:editId="5AF3EDCF">
+            <wp:extent cx="5400040" cy="5826125"/>
+            <wp:effectExtent l="0" t="0" r="0" b="3175"/>
+            <wp:docPr id="831107684" name="Imagen 1"/>
+            <wp:cNvGraphicFramePr>
+              <a:graphicFrameLocks xmlns:a="http://schemas.openxmlformats.org/drawingml/2006/main" noChangeAspect="1"/>
+            </wp:cNvGraphicFramePr>
+            <a:graphic xmlns:a="http://schemas.openxmlformats.org/drawingml/2006/main">
+              <a:graphicData uri="http://schemas.openxmlformats.org/drawingml/2006/picture">
+                <pic:pic xmlns:pic="http://schemas.openxmlformats.org/drawingml/2006/picture">
+                  <pic:nvPicPr>
+                    <pic:cNvPr id="831107684" name=""/>
+                    <pic:cNvPicPr/>
+                  </pic:nvPicPr>
+                  <pic:blipFill>
+                    <a:blip r:embed="rId5"/>
+                    <a:stretch>
+                      <a:fillRect/>
+                    </a:stretch>
+                  </pic:blipFill>
+                  <pic:spPr>
+                    <a:xfrm>
+                      <a:off x="0" y="0"/>
+                      <a:ext cx="5400040" cy="5826125"/>
+                    </a:xfrm>
+                    <a:prstGeom prst="rect">
+                      <a:avLst/>
+                    </a:prstGeom>
+                  </pic:spPr>
+                </pic:pic>
+              </a:graphicData>
+            </a:graphic>
+          </wp:inline>
+        </w:drawing>
+      </w:r>
+    </w:p>
+    <w:p>
+      <w:pPr>
+        <w:ind w:left="360"/>
+        <w:jc w:val="both"/>
+      </w:pPr>
+      <w:r>
+        <w:rPr>
+          <w:noProof/>
+        </w:rPr>
+        <w:lastRenderedPageBreak/>
+        <w:drawing>
+          <wp:inline distT="0" distB="0" distL="0" distR="0" wp14:anchorId="141DB4B6" wp14:editId="1E6EDCD2">
+            <wp:extent cx="5400040" cy="5755640"/>
+            <wp:effectExtent l="0" t="0" r="0" b="0"/>
+            <wp:docPr id="186706905" name="Imagen 1"/>
+            <wp:cNvGraphicFramePr>
+              <a:graphicFrameLocks xmlns:a="http://schemas.openxmlformats.org/drawingml/2006/main" noChangeAspect="1"/>
+            </wp:cNvGraphicFramePr>
+            <a:graphic xmlns:a="http://schemas.openxmlformats.org/drawingml/2006/main">
+              <a:graphicData uri="http://schemas.openxmlformats.org/drawingml/2006/picture">
+                <pic:pic xmlns:pic="http://schemas.openxmlformats.org/drawingml/2006/picture">
+                  <pic:nvPicPr>
+                    <pic:cNvPr id="186706905" name=""/>
+                    <pic:cNvPicPr/>
+                  </pic:nvPicPr>
+                  <pic:blipFill>
+                    <a:blip r:embed="rId6"/>
+                    <a:stretch>
+                      <a:fillRect/>
+                    </a:stretch>
+                  </pic:blipFill>
+                  <pic:spPr>
+                    <a:xfrm>
+                      <a:off x="0" y="0"/>
+                      <a:ext cx="5400040" cy="5755640"/>
+                    </a:xfrm>
+                    <a:prstGeom prst="rect">
+                      <a:avLst/>
+                    </a:prstGeom>
+                  </pic:spPr>
+                </pic:pic>
+              </a:graphicData>
+            </a:graphic>
+          </wp:inline>
+        </w:drawing>
+      </w:r>
+      <w:r>
+        <w:rPr>
+          <w:noProof/>
+        </w:rPr>
+        <w:lastRenderedPageBreak/>
+        <w:drawing>
+          <wp:inline distT="0" distB="0" distL="0" distR="0" wp14:anchorId="57592A68" wp14:editId="1DF9CD6D">
+            <wp:extent cx="5400040" cy="3895725"/>
+            <wp:effectExtent l="0" t="0" r="0" b="9525"/>
+            <wp:docPr id="100120707" name="Imagen 1"/>
+            <wp:cNvGraphicFramePr>
+              <a:graphicFrameLocks xmlns:a="http://schemas.openxmlformats.org/drawingml/2006/main" noChangeAspect="1"/>
+            </wp:cNvGraphicFramePr>
+            <a:graphic xmlns:a="http://schemas.openxmlformats.org/drawingml/2006/main">
+              <a:graphicData uri="http://schemas.openxmlformats.org/drawingml/2006/picture">
+                <pic:pic xmlns:pic="http://schemas.openxmlformats.org/drawingml/2006/picture">
+                  <pic:nvPicPr>
+                    <pic:cNvPr id="100120707" name=""/>
+                    <pic:cNvPicPr/>
+                  </pic:nvPicPr>
+                  <pic:blipFill>
+                    <a:blip r:embed="rId7"/>
+                    <a:stretch>
+                      <a:fillRect/>
+                    </a:stretch>
+                  </pic:blipFill>
+                  <pic:spPr>
+                    <a:xfrm>
+                      <a:off x="0" y="0"/>
+                      <a:ext cx="5400040" cy="3895725"/>
+                    </a:xfrm>
+                    <a:prstGeom prst="rect">
+                      <a:avLst/>
+                    </a:prstGeom>
+                  </pic:spPr>
+                </pic:pic>
+              </a:graphicData>
+            </a:graphic>
+          </wp:inline>
+        </w:drawing>
+      </w:r>
+    </w:p>
+    <w:p>
+      <w:pPr>
+        <w:ind w:left="360"/>
+        <w:jc w:val="both"/>
+      </w:pPr>
+    </w:p>
+    <w:p>
+      <w:pPr>
+        <w:ind w:firstLine="360"/>
+        <w:jc w:val="both"/>
+      </w:pPr>
+      <w:r>
+        <w:rPr>
+          <w:noProof/>
+        </w:rPr>
+        <w:drawing>
+          <wp:inline distT="0" distB="0" distL="0" distR="0" wp14:anchorId="6C69F6B5" wp14:editId="5980BDA3">
+            <wp:extent cx="5400040" cy="2540635"/>
+            <wp:effectExtent l="0" t="0" r="0" b="0"/>
+            <wp:docPr id="247534805" name="Imagen 1"/>
+            <wp:cNvGraphicFramePr>
+              <a:graphicFrameLocks xmlns:a="http://schemas.openxmlformats.org/drawingml/2006/main" noChangeAspect="1"/>
+            </wp:cNvGraphicFramePr>
+            <a:graphic xmlns:a="http://schemas.openxmlformats.org/drawingml/2006/main">
+              <a:graphicData uri="http://schemas.openxmlformats.org/drawingml/2006/picture">
+                <pic:pic xmlns:pic="http://schemas.openxmlformats.org/drawingml/2006/picture">
+                  <pic:nvPicPr>
+                    <pic:cNvPr id="247534805" name=""/>
+                    <pic:cNvPicPr/>
+                  </pic:nvPicPr>
+                  <pic:blipFill>
+                    <a:blip r:embed="rId8"/>
+                    <a:stretch>
+                      <a:fillRect/>
+                    </a:stretch>
+                  </pic:blipFill>
+                  <pic:spPr>
+                    <a:xfrm>
+                      <a:off x="0" y="0"/>
+                      <a:ext cx="5400040" cy="2540635"/>
+                    </a:xfrm>
+                    <a:prstGeom prst="rect">
+                      <a:avLst/>
+                    </a:prstGeom>
+                  </pic:spPr>
+                </pic:pic>
+              </a:graphicData>
+            </a:graphic>
+          </wp:inline>
+        </w:drawing>
+      </w:r>
+    </w:p>
+    <w:p>
+      <w:pPr>
+        <w:pStyle w:val="Prrafodelista"/>
+        <w:jc w:val="both"/>
+      </w:pPr>
     </w:p>
     <w:p>
       <w:pPr>
@@ -267,9 +651,677 @@
           <w:ilvl w:val="0"/>
           <w:numId w:val="2"/>
         </w:numPr>
+        <w:jc w:val="both"/>
       </w:pPr>
       <w:r>
         <w:t>Creación de ramas</w:t>
+      </w:r>
+    </w:p>
+    <w:p>
+      <w:pPr>
+        <w:pStyle w:val="Prrafodelista"/>
+        <w:jc w:val="both"/>
+      </w:pPr>
+      <w:r>
+        <w:t>Se creó dos ramas:</w:t>
+      </w:r>
+    </w:p>
+    <w:p>
+      <w:pPr>
+        <w:pStyle w:val="Prrafodelista"/>
+        <w:numPr>
+          <w:ilvl w:val="0"/>
+          <w:numId w:val="3"/>
+        </w:numPr>
+        <w:jc w:val="both"/>
+      </w:pPr>
+      <w:r>
+        <w:rPr>
+          <w:b/>
+          <w:bCs/>
+        </w:rPr>
+        <w:t>Principal</w:t>
+      </w:r>
+      <w:r>
+        <w:rPr>
+          <w:b/>
+          <w:bCs/>
+        </w:rPr>
+        <w:t xml:space="preserve"> (Producción)</w:t>
+      </w:r>
+      <w:r>
+        <w:rPr>
+          <w:b/>
+          <w:bCs/>
+        </w:rPr>
+        <w:t>:</w:t>
+      </w:r>
+      <w:r>
+        <w:t xml:space="preserve"> Es la rama principal </w:t>
+      </w:r>
+      <w:r>
+        <w:t xml:space="preserve">y es la utilizada para la limpieza, consolidación de </w:t>
+      </w:r>
+      <w:r>
+        <w:t>reportes. Contiene la versión del pipeline que se realizan de manera manual</w:t>
+      </w:r>
+      <w:r>
+        <w:t xml:space="preserve"> y ningún integrante trabaja sobre ella, porque sino </w:t>
+      </w:r>
+      <w:r>
+        <w:t>se pueden producir errores en el código que se encuentra funcionando bien.</w:t>
+      </w:r>
+    </w:p>
+    <w:p>
+      <w:pPr>
+        <w:pStyle w:val="Prrafodelista"/>
+        <w:numPr>
+          <w:ilvl w:val="0"/>
+          <w:numId w:val="3"/>
+        </w:numPr>
+        <w:jc w:val="both"/>
+      </w:pPr>
+      <w:r>
+        <w:rPr>
+          <w:b/>
+          <w:bCs/>
+        </w:rPr>
+        <w:lastRenderedPageBreak/>
+        <w:t>Reportaje</w:t>
+      </w:r>
+      <w:r>
+        <w:rPr>
+          <w:b/>
+          <w:bCs/>
+        </w:rPr>
+        <w:t>/</w:t>
+      </w:r>
+      <w:r>
+        <w:rPr>
+          <w:b/>
+          <w:bCs/>
+        </w:rPr>
+        <w:t>Cambio-hora</w:t>
+      </w:r>
+      <w:r>
+        <w:rPr>
+          <w:b/>
+          <w:bCs/>
+        </w:rPr>
+        <w:t xml:space="preserve"> (Desarrollo)</w:t>
+      </w:r>
+      <w:r>
+        <w:t>:</w:t>
+      </w:r>
+      <w:r>
+        <w:t xml:space="preserve"> Rama secundaria e independiente </w:t>
+      </w:r>
+      <w:r>
+        <w:t xml:space="preserve">para solucionar el </w:t>
+      </w:r>
+      <w:r>
+        <w:t xml:space="preserve">problema </w:t>
+      </w:r>
+      <w:r>
+        <w:t xml:space="preserve">de cambio de hora durante el día. Permite </w:t>
+      </w:r>
+      <w:r>
+        <w:t xml:space="preserve">que cuando un miembro del equipo decide ejecutar </w:t>
+      </w:r>
+      <w:r>
+        <w:t>crea una rama</w:t>
+      </w:r>
+      <w:r>
+        <w:t xml:space="preserve">, se crea de manera </w:t>
+      </w:r>
+      <w:r>
+        <w:t>aislada</w:t>
+      </w:r>
+      <w:r>
+        <w:t xml:space="preserve"> a partir de la principal</w:t>
+      </w:r>
+      <w:r>
+        <w:t>.</w:t>
+      </w:r>
+      <w:r>
+        <w:t xml:space="preserve"> </w:t>
+      </w:r>
+      <w:r>
+        <w:t>Es decir, una</w:t>
+      </w:r>
+      <w:r>
+        <w:t xml:space="preserve"> vez que se actualice otra versión, los cambios se envían a la nube </w:t>
+      </w:r>
+      <w:r>
+        <w:t>y no afectaría los cambios del equipo.</w:t>
+      </w:r>
+    </w:p>
+    <w:p>
+      <w:pPr>
+        <w:jc w:val="both"/>
+      </w:pPr>
+    </w:p>
+    <w:p>
+      <w:pPr>
+        <w:ind w:left="708"/>
+      </w:pPr>
+      <w:r>
+        <w:t>Comandos de Git Utilizados:</w:t>
+      </w:r>
+    </w:p>
+    <w:p>
+      <w:pPr>
+        <w:ind w:left="708"/>
+      </w:pPr>
+      <w:r>
+        <w:rPr>
+          <w:noProof/>
+        </w:rPr>
+        <w:drawing>
+          <wp:inline distT="0" distB="0" distL="0" distR="0" wp14:anchorId="3F2510B8" wp14:editId="7A01B0BD">
+            <wp:extent cx="5400040" cy="2334260"/>
+            <wp:effectExtent l="0" t="0" r="0" b="8890"/>
+            <wp:docPr id="924432930" name="Imagen 1"/>
+            <wp:cNvGraphicFramePr>
+              <a:graphicFrameLocks xmlns:a="http://schemas.openxmlformats.org/drawingml/2006/main" noChangeAspect="1"/>
+            </wp:cNvGraphicFramePr>
+            <a:graphic xmlns:a="http://schemas.openxmlformats.org/drawingml/2006/main">
+              <a:graphicData uri="http://schemas.openxmlformats.org/drawingml/2006/picture">
+                <pic:pic xmlns:pic="http://schemas.openxmlformats.org/drawingml/2006/picture">
+                  <pic:nvPicPr>
+                    <pic:cNvPr id="924432930" name=""/>
+                    <pic:cNvPicPr/>
+                  </pic:nvPicPr>
+                  <pic:blipFill>
+                    <a:blip r:embed="rId9"/>
+                    <a:stretch>
+                      <a:fillRect/>
+                    </a:stretch>
+                  </pic:blipFill>
+                  <pic:spPr>
+                    <a:xfrm>
+                      <a:off x="0" y="0"/>
+                      <a:ext cx="5400040" cy="2334260"/>
+                    </a:xfrm>
+                    <a:prstGeom prst="rect">
+                      <a:avLst/>
+                    </a:prstGeom>
+                  </pic:spPr>
+                </pic:pic>
+              </a:graphicData>
+            </a:graphic>
+          </wp:inline>
+        </w:drawing>
+      </w:r>
+    </w:p>
+    <w:p>
+      <w:pPr>
+        <w:ind w:left="708"/>
+      </w:pPr>
+      <w:r>
+        <w:t>Cada integrante sigue los pasos</w:t>
+      </w:r>
+      <w:r>
+        <w:t xml:space="preserve"> desde Git Bash para registrar y subir sus cambios:</w:t>
+      </w:r>
+    </w:p>
+    <w:p>
+      <w:pPr>
+        <w:pStyle w:val="Prrafodelista"/>
+        <w:numPr>
+          <w:ilvl w:val="0"/>
+          <w:numId w:val="4"/>
+        </w:numPr>
+      </w:pPr>
+      <w:r>
+        <w:t>Crear la rama de trabajo</w:t>
+      </w:r>
+      <w:r>
+        <w:t xml:space="preserve"> a partir de </w:t>
+      </w:r>
+      <w:r>
+        <w:t>“</w:t>
+      </w:r>
+      <w:proofErr w:type="spellStart"/>
+      <w:r>
+        <w:t>main</w:t>
+      </w:r>
+      <w:proofErr w:type="spellEnd"/>
+      <w:r>
+        <w:t>”</w:t>
+      </w:r>
+      <w:r>
+        <w:t xml:space="preserve">, donde </w:t>
+      </w:r>
+      <w:r>
+        <w:t>cada integrante del equipo puede trabajar tranquilo sin afectar el código principal.</w:t>
+      </w:r>
+    </w:p>
+    <w:p>
+      <w:pPr>
+        <w:pStyle w:val="Prrafodelista"/>
+        <w:ind w:left="1068" w:firstLine="348"/>
+        <w:rPr>
+          <w:b/>
+          <w:bCs/>
+        </w:rPr>
+      </w:pPr>
+      <w:proofErr w:type="spellStart"/>
+      <w:r>
+        <w:rPr>
+          <w:b/>
+          <w:bCs/>
+        </w:rPr>
+        <w:t>git</w:t>
+      </w:r>
+      <w:proofErr w:type="spellEnd"/>
+      <w:r>
+        <w:rPr>
+          <w:b/>
+          <w:bCs/>
+        </w:rPr>
+        <w:t xml:space="preserve"> </w:t>
+      </w:r>
+      <w:proofErr w:type="spellStart"/>
+      <w:r>
+        <w:rPr>
+          <w:b/>
+          <w:bCs/>
+        </w:rPr>
+        <w:t>checkout</w:t>
+      </w:r>
+      <w:proofErr w:type="spellEnd"/>
+      <w:r>
+        <w:rPr>
+          <w:b/>
+          <w:bCs/>
+        </w:rPr>
+        <w:t xml:space="preserve"> -b </w:t>
+      </w:r>
+      <w:proofErr w:type="spellStart"/>
+      <w:r>
+        <w:rPr>
+          <w:b/>
+          <w:bCs/>
+        </w:rPr>
+        <w:t>feature</w:t>
+      </w:r>
+      <w:proofErr w:type="spellEnd"/>
+      <w:r>
+        <w:rPr>
+          <w:b/>
+          <w:bCs/>
+        </w:rPr>
+        <w:t>/cambio-hora-reporte</w:t>
+      </w:r>
+    </w:p>
+    <w:p>
+      <w:pPr>
+        <w:pStyle w:val="Prrafodelista"/>
+        <w:numPr>
+          <w:ilvl w:val="0"/>
+          <w:numId w:val="4"/>
+        </w:numPr>
+      </w:pPr>
+      <w:r>
+        <w:t>Sele</w:t>
+      </w:r>
+      <w:r>
+        <w:t>c</w:t>
+      </w:r>
+      <w:r>
+        <w:t>cionara todos los archivos modificados</w:t>
+      </w:r>
+      <w:r>
+        <w:t xml:space="preserve"> y serán registrados en el siguiente paso.</w:t>
+      </w:r>
+    </w:p>
+    <w:p>
+      <w:pPr>
+        <w:pStyle w:val="Prrafodelista"/>
+        <w:ind w:left="1416"/>
+        <w:rPr>
+          <w:b/>
+          <w:bCs/>
+        </w:rPr>
+      </w:pPr>
+      <w:r>
+        <w:rPr>
+          <w:b/>
+          <w:bCs/>
+        </w:rPr>
+        <w:t xml:space="preserve">Git </w:t>
+      </w:r>
+      <w:proofErr w:type="spellStart"/>
+      <w:r>
+        <w:rPr>
+          <w:b/>
+          <w:bCs/>
+        </w:rPr>
+        <w:t>add</w:t>
+      </w:r>
+      <w:proofErr w:type="spellEnd"/>
+      <w:r>
+        <w:rPr>
+          <w:b/>
+          <w:bCs/>
+        </w:rPr>
+        <w:t>.</w:t>
+      </w:r>
+    </w:p>
+    <w:p>
+      <w:pPr>
+        <w:pStyle w:val="Prrafodelista"/>
+        <w:numPr>
+          <w:ilvl w:val="0"/>
+          <w:numId w:val="4"/>
+        </w:numPr>
+      </w:pPr>
+      <w:r>
+        <w:t xml:space="preserve">Este paso guarda con un mensaje </w:t>
+      </w:r>
+      <w:r>
+        <w:t xml:space="preserve">que queda registrado en el historial, indicando quién </w:t>
+      </w:r>
+      <w:r>
+        <w:t xml:space="preserve">de los integrantes </w:t>
+      </w:r>
+      <w:r>
+        <w:t>hizo el cambio y cuándo</w:t>
+      </w:r>
+      <w:r>
+        <w:t>.</w:t>
+      </w:r>
+    </w:p>
+    <w:p>
+      <w:pPr>
+        <w:ind w:left="1068" w:firstLine="348"/>
+        <w:rPr>
+          <w:b/>
+          <w:bCs/>
+        </w:rPr>
+      </w:pPr>
+      <w:proofErr w:type="spellStart"/>
+      <w:r>
+        <w:rPr>
+          <w:b/>
+          <w:bCs/>
+        </w:rPr>
+        <w:t>git</w:t>
+      </w:r>
+      <w:proofErr w:type="spellEnd"/>
+      <w:r>
+        <w:rPr>
+          <w:b/>
+          <w:bCs/>
+        </w:rPr>
+        <w:t xml:space="preserve"> </w:t>
+      </w:r>
+      <w:proofErr w:type="spellStart"/>
+      <w:r>
+        <w:rPr>
+          <w:b/>
+          <w:bCs/>
+        </w:rPr>
+        <w:t>commit</w:t>
+      </w:r>
+      <w:proofErr w:type="spellEnd"/>
+      <w:r>
+        <w:rPr>
+          <w:b/>
+          <w:bCs/>
+        </w:rPr>
+        <w:t xml:space="preserve"> -m "Versión 1.1: Modificación de la lógica para el reporte de la tarde"</w:t>
+      </w:r>
+    </w:p>
+    <w:p>
+      <w:pPr>
+        <w:pStyle w:val="Prrafodelista"/>
+        <w:numPr>
+          <w:ilvl w:val="0"/>
+          <w:numId w:val="4"/>
+        </w:numPr>
+      </w:pPr>
+      <w:r>
+        <w:t>Luego se su</w:t>
+      </w:r>
+      <w:r>
+        <w:t xml:space="preserve">be la rama </w:t>
+      </w:r>
+      <w:r>
+        <w:t xml:space="preserve">para que todo </w:t>
+      </w:r>
+      <w:r>
+        <w:t>el equipo pueda visualizarla</w:t>
+      </w:r>
+      <w:r>
+        <w:t>.</w:t>
+      </w:r>
+    </w:p>
+    <w:p>
+      <w:pPr>
+        <w:ind w:left="1416"/>
+        <w:rPr>
+          <w:b/>
+          <w:bCs/>
+        </w:rPr>
+      </w:pPr>
+      <w:proofErr w:type="spellStart"/>
+      <w:r>
+        <w:rPr>
+          <w:b/>
+          <w:bCs/>
+        </w:rPr>
+        <w:t>git</w:t>
+      </w:r>
+      <w:proofErr w:type="spellEnd"/>
+      <w:r>
+        <w:rPr>
+          <w:b/>
+          <w:bCs/>
+        </w:rPr>
+        <w:t xml:space="preserve"> </w:t>
+      </w:r>
+      <w:proofErr w:type="spellStart"/>
+      <w:r>
+        <w:rPr>
+          <w:b/>
+          <w:bCs/>
+        </w:rPr>
+        <w:t>push</w:t>
+      </w:r>
+      <w:proofErr w:type="spellEnd"/>
+      <w:r>
+        <w:rPr>
+          <w:b/>
+          <w:bCs/>
+        </w:rPr>
+        <w:t xml:space="preserve"> </w:t>
+      </w:r>
+      <w:proofErr w:type="spellStart"/>
+      <w:r>
+        <w:rPr>
+          <w:b/>
+          <w:bCs/>
+        </w:rPr>
+        <w:t>origin</w:t>
+      </w:r>
+      <w:proofErr w:type="spellEnd"/>
+      <w:r>
+        <w:rPr>
+          <w:b/>
+          <w:bCs/>
+        </w:rPr>
+        <w:t xml:space="preserve"> </w:t>
+      </w:r>
+      <w:proofErr w:type="spellStart"/>
+      <w:r>
+        <w:rPr>
+          <w:b/>
+          <w:bCs/>
+        </w:rPr>
+        <w:t>feature</w:t>
+      </w:r>
+      <w:proofErr w:type="spellEnd"/>
+      <w:r>
+        <w:rPr>
+          <w:b/>
+          <w:bCs/>
+        </w:rPr>
+        <w:t>/cambio-hora-reporte</w:t>
+      </w:r>
+    </w:p>
+    <w:p>
+      <w:pPr>
+        <w:pStyle w:val="Prrafodelista"/>
+        <w:numPr>
+          <w:ilvl w:val="0"/>
+          <w:numId w:val="4"/>
+        </w:numPr>
+      </w:pPr>
+      <w:r>
+        <w:t>Cuando se haya subido</w:t>
+      </w:r>
+      <w:r>
+        <w:t xml:space="preserve"> la rama, GitHub genera un </w:t>
+      </w:r>
+      <w:proofErr w:type="spellStart"/>
+      <w:r>
+        <w:t>enalce</w:t>
+      </w:r>
+      <w:proofErr w:type="spellEnd"/>
+      <w:r>
+        <w:t xml:space="preserve"> para abrir </w:t>
+      </w:r>
+      <w:r>
+        <w:t xml:space="preserve">un Pull </w:t>
+      </w:r>
+      <w:proofErr w:type="spellStart"/>
+      <w:r>
+        <w:t>Request</w:t>
+      </w:r>
+      <w:proofErr w:type="spellEnd"/>
+      <w:r>
+        <w:t xml:space="preserve"> hacia </w:t>
+      </w:r>
+      <w:r>
+        <w:t>“</w:t>
+      </w:r>
+      <w:proofErr w:type="spellStart"/>
+      <w:r>
+        <w:t>main</w:t>
+      </w:r>
+      <w:proofErr w:type="spellEnd"/>
+      <w:r>
+        <w:t>”</w:t>
+      </w:r>
+      <w:r>
+        <w:t>.</w:t>
+      </w:r>
+      <w:r>
+        <w:t xml:space="preserve"> Permite que el equipo revise los cambios de integrarlos al código principal.</w:t>
+      </w:r>
+    </w:p>
+    <w:p>
+      <w:pPr>
+        <w:ind w:firstLine="708"/>
+      </w:pPr>
+      <w:r>
+        <w:rPr>
+          <w:noProof/>
+        </w:rPr>
+        <w:lastRenderedPageBreak/>
+        <w:drawing>
+          <wp:inline distT="0" distB="0" distL="0" distR="0" wp14:anchorId="66FF0A7E" wp14:editId="4B48CADB">
+            <wp:extent cx="5400040" cy="2334260"/>
+            <wp:effectExtent l="0" t="0" r="0" b="8890"/>
+            <wp:docPr id="551052059" name="Imagen 1"/>
+            <wp:cNvGraphicFramePr>
+              <a:graphicFrameLocks xmlns:a="http://schemas.openxmlformats.org/drawingml/2006/main" noChangeAspect="1"/>
+            </wp:cNvGraphicFramePr>
+            <a:graphic xmlns:a="http://schemas.openxmlformats.org/drawingml/2006/main">
+              <a:graphicData uri="http://schemas.openxmlformats.org/drawingml/2006/picture">
+                <pic:pic xmlns:pic="http://schemas.openxmlformats.org/drawingml/2006/picture">
+                  <pic:nvPicPr>
+                    <pic:cNvPr id="924432930" name=""/>
+                    <pic:cNvPicPr/>
+                  </pic:nvPicPr>
+                  <pic:blipFill>
+                    <a:blip r:embed="rId9"/>
+                    <a:stretch>
+                      <a:fillRect/>
+                    </a:stretch>
+                  </pic:blipFill>
+                  <pic:spPr>
+                    <a:xfrm>
+                      <a:off x="0" y="0"/>
+                      <a:ext cx="5400040" cy="2334260"/>
+                    </a:xfrm>
+                    <a:prstGeom prst="rect">
+                      <a:avLst/>
+                    </a:prstGeom>
+                  </pic:spPr>
+                </pic:pic>
+              </a:graphicData>
+            </a:graphic>
+          </wp:inline>
+        </w:drawing>
+      </w:r>
+    </w:p>
+    <w:p/>
+    <w:p>
+      <w:pPr>
+        <w:ind w:firstLine="708"/>
+      </w:pPr>
+    </w:p>
+    <w:p>
+      <w:pPr>
+        <w:ind w:firstLine="708"/>
+      </w:pPr>
+    </w:p>
+    <w:p>
+      <w:pPr>
+        <w:ind w:left="708"/>
+      </w:pPr>
+      <w:r>
+        <w:rPr>
+          <w:noProof/>
+        </w:rPr>
+        <w:drawing>
+          <wp:inline distT="0" distB="0" distL="0" distR="0" wp14:anchorId="22D87454" wp14:editId="4BBB7E2B">
+            <wp:extent cx="5400040" cy="2304415"/>
+            <wp:effectExtent l="0" t="0" r="0" b="635"/>
+            <wp:docPr id="1139765395" name="Imagen 1"/>
+            <wp:cNvGraphicFramePr>
+              <a:graphicFrameLocks xmlns:a="http://schemas.openxmlformats.org/drawingml/2006/main" noChangeAspect="1"/>
+            </wp:cNvGraphicFramePr>
+            <a:graphic xmlns:a="http://schemas.openxmlformats.org/drawingml/2006/main">
+              <a:graphicData uri="http://schemas.openxmlformats.org/drawingml/2006/picture">
+                <pic:pic xmlns:pic="http://schemas.openxmlformats.org/drawingml/2006/picture">
+                  <pic:nvPicPr>
+                    <pic:cNvPr id="1139765395" name=""/>
+                    <pic:cNvPicPr/>
+                  </pic:nvPicPr>
+                  <pic:blipFill>
+                    <a:blip r:embed="rId10"/>
+                    <a:stretch>
+                      <a:fillRect/>
+                    </a:stretch>
+                  </pic:blipFill>
+                  <pic:spPr>
+                    <a:xfrm>
+                      <a:off x="0" y="0"/>
+                      <a:ext cx="5400040" cy="2304415"/>
+                    </a:xfrm>
+                    <a:prstGeom prst="rect">
+                      <a:avLst/>
+                    </a:prstGeom>
+                  </pic:spPr>
+                </pic:pic>
+              </a:graphicData>
+            </a:graphic>
+          </wp:inline>
+        </w:drawing>
       </w:r>
     </w:p>
     <w:p>
@@ -321,6 +1373,97 @@
 <file path=word/numbering.xml><?xml version="1.0" encoding="utf-8"?>
 <w:numbering xmlns:wpc="http://schemas.microsoft.com/office/word/2010/wordprocessingCanvas" xmlns:cx="http://schemas.microsoft.com/office/drawing/2014/chartex" xmlns:cx1="http://schemas.microsoft.com/office/drawing/2015/9/8/chartex" xmlns:cx2="http://schemas.microsoft.com/office/drawing/2015/10/21/chartex" xmlns:cx3="http://schemas.microsoft.com/office/drawing/2016/5/9/chartex" xmlns:cx4="http://schemas.microsoft.com/office/drawing/2016/5/10/chartex" xmlns:cx5="http://schemas.microsoft.com/office/drawing/2016/5/11/chartex" xmlns:cx6="http://schemas.microsoft.com/office/drawing/2016/5/12/chartex" xmlns:cx7="http://schemas.microsoft.com/office/drawing/2016/5/13/chartex" xmlns:cx8="http://schemas.microsoft.com/office/drawing/2016/5/14/chartex" xmlns:mc="http://schemas.openxmlformats.org/markup-compatibility/2006" xmlns:aink="http://schemas.microsoft.com/office/drawing/2016/ink" xmlns:am3d="http://schemas.microsoft.com/office/drawing/2017/model3d" xmlns:o="urn:schemas-microsoft-com:office:office" xmlns:oel="http://schemas.microsoft.com/office/2019/extlst" xmlns:r="http://schemas.openxmlformats.org/officeDocument/2006/relationships" xmlns:m="http://schemas.openxmlformats.org/officeDocument/2006/math" xmlns:v="urn:schemas-microsoft-com:vml" xmlns:wp14="http://schemas.microsoft.com/office/word/2010/wordprocessingDrawing" xmlns:wp="http://schemas.openxmlformats.org/drawingml/2006/wordprocessingDrawing" xmlns:w10="urn:schemas-microsoft-com:office:word" xmlns:w="http://schemas.openxmlformats.org/wordprocessingml/2006/main" xmlns:w14="http://schemas.microsoft.com/office/word/2010/wordml" xmlns:w15="http://schemas.microsoft.com/office/word/2012/wordml" xmlns:w16cex="http://schemas.microsoft.com/office/word/2018/wordml/cex" xmlns:w16cid="http://schemas.microsoft.com/office/word/2016/wordml/cid" xmlns:w16="http://schemas.microsoft.com/office/word/2018/wordml" xmlns:w16du="http://schemas.microsoft.com/office/word/2023/wordml/word16du" xmlns:w16sdtdh="http://schemas.microsoft.com/office/word/2020/wordml/sdtdatahash" xmlns:w16sdtfl="http://schemas.microsoft.com/office/word/2024/wordml/sdtformatlock" xmlns:w16se="http://schemas.microsoft.com/office/word/2015/wordml/symex" xmlns:wpg="http://schemas.microsoft.com/office/word/2010/wordprocessingGroup" xmlns:wpi="http://schemas.microsoft.com/office/word/2010/wordprocessingInk" xmlns:wne="http://schemas.microsoft.com/office/word/2006/wordml" xmlns:wps="http://schemas.microsoft.com/office/word/2010/wordprocessingShape" mc:Ignorable="w14 w15 w16se w16cid w16 w16cex w16sdtdh w16sdtfl w16du wp14">
   <w:abstractNum w:abstractNumId="0" w15:restartNumberingAfterBreak="0">
+    <w:nsid w:val="119C40E3"/>
+    <w:multiLevelType w:val="hybridMultilevel"/>
+    <w:tmpl w:val="674439D2"/>
+    <w:lvl w:ilvl="0" w:tplc="8F869B3E">
+      <w:start w:val="1"/>
+      <w:numFmt w:val="decimal"/>
+      <w:lvlText w:val="%1."/>
+      <w:lvlJc w:val="left"/>
+      <w:pPr>
+        <w:ind w:left="1068" w:hanging="360"/>
+      </w:pPr>
+      <w:rPr>
+        <w:rFonts w:hint="default"/>
+        <w:b w:val="0"/>
+        <w:bCs w:val="0"/>
+      </w:rPr>
+    </w:lvl>
+    <w:lvl w:ilvl="1" w:tplc="280A0019" w:tentative="1">
+      <w:start w:val="1"/>
+      <w:numFmt w:val="lowerLetter"/>
+      <w:lvlText w:val="%2."/>
+      <w:lvlJc w:val="left"/>
+      <w:pPr>
+        <w:ind w:left="1788" w:hanging="360"/>
+      </w:pPr>
+    </w:lvl>
+    <w:lvl w:ilvl="2" w:tplc="280A001B" w:tentative="1">
+      <w:start w:val="1"/>
+      <w:numFmt w:val="lowerRoman"/>
+      <w:lvlText w:val="%3."/>
+      <w:lvlJc w:val="right"/>
+      <w:pPr>
+        <w:ind w:left="2508" w:hanging="180"/>
+      </w:pPr>
+    </w:lvl>
+    <w:lvl w:ilvl="3" w:tplc="280A000F" w:tentative="1">
+      <w:start w:val="1"/>
+      <w:numFmt w:val="decimal"/>
+      <w:lvlText w:val="%4."/>
+      <w:lvlJc w:val="left"/>
+      <w:pPr>
+        <w:ind w:left="3228" w:hanging="360"/>
+      </w:pPr>
+    </w:lvl>
+    <w:lvl w:ilvl="4" w:tplc="280A0019" w:tentative="1">
+      <w:start w:val="1"/>
+      <w:numFmt w:val="lowerLetter"/>
+      <w:lvlText w:val="%5."/>
+      <w:lvlJc w:val="left"/>
+      <w:pPr>
+        <w:ind w:left="3948" w:hanging="360"/>
+      </w:pPr>
+    </w:lvl>
+    <w:lvl w:ilvl="5" w:tplc="280A001B" w:tentative="1">
+      <w:start w:val="1"/>
+      <w:numFmt w:val="lowerRoman"/>
+      <w:lvlText w:val="%6."/>
+      <w:lvlJc w:val="right"/>
+      <w:pPr>
+        <w:ind w:left="4668" w:hanging="180"/>
+      </w:pPr>
+    </w:lvl>
+    <w:lvl w:ilvl="6" w:tplc="280A000F" w:tentative="1">
+      <w:start w:val="1"/>
+      <w:numFmt w:val="decimal"/>
+      <w:lvlText w:val="%7."/>
+      <w:lvlJc w:val="left"/>
+      <w:pPr>
+        <w:ind w:left="5388" w:hanging="360"/>
+      </w:pPr>
+    </w:lvl>
+    <w:lvl w:ilvl="7" w:tplc="280A0019" w:tentative="1">
+      <w:start w:val="1"/>
+      <w:numFmt w:val="lowerLetter"/>
+      <w:lvlText w:val="%8."/>
+      <w:lvlJc w:val="left"/>
+      <w:pPr>
+        <w:ind w:left="6108" w:hanging="360"/>
+      </w:pPr>
+    </w:lvl>
+    <w:lvl w:ilvl="8" w:tplc="280A001B" w:tentative="1">
+      <w:start w:val="1"/>
+      <w:numFmt w:val="lowerRoman"/>
+      <w:lvlText w:val="%9."/>
+      <w:lvlJc w:val="right"/>
+      <w:pPr>
+        <w:ind w:left="6828" w:hanging="180"/>
+      </w:pPr>
+    </w:lvl>
+  </w:abstractNum>
+  <w:abstractNum w:abstractNumId="1" w15:restartNumberingAfterBreak="0">
     <w:nsid w:val="38140C3B"/>
     <w:multiLevelType w:val="hybridMultilevel"/>
     <w:tmpl w:val="69E622C6"/>
@@ -460,7 +1603,7 @@
       </w:rPr>
     </w:lvl>
   </w:abstractNum>
-  <w:abstractNum w:abstractNumId="1" w15:restartNumberingAfterBreak="0">
+  <w:abstractNum w:abstractNumId="2" w15:restartNumberingAfterBreak="0">
     <w:nsid w:val="55184E5B"/>
     <w:multiLevelType w:val="multilevel"/>
     <w:tmpl w:val="3580F13E"/>
@@ -581,11 +1724,129 @@
       </w:rPr>
     </w:lvl>
   </w:abstractNum>
+  <w:abstractNum w:abstractNumId="3" w15:restartNumberingAfterBreak="0">
+    <w:nsid w:val="5CF738D6"/>
+    <w:multiLevelType w:val="hybridMultilevel"/>
+    <w:tmpl w:val="0BA2AC04"/>
+    <w:lvl w:ilvl="0" w:tplc="194022D0">
+      <w:numFmt w:val="bullet"/>
+      <w:lvlText w:val="-"/>
+      <w:lvlJc w:val="left"/>
+      <w:pPr>
+        <w:ind w:left="1080" w:hanging="360"/>
+      </w:pPr>
+      <w:rPr>
+        <w:rFonts w:ascii="Aptos" w:eastAsiaTheme="minorHAnsi" w:hAnsi="Aptos" w:cstheme="minorBidi" w:hint="default"/>
+      </w:rPr>
+    </w:lvl>
+    <w:lvl w:ilvl="1" w:tplc="280A0003" w:tentative="1">
+      <w:start w:val="1"/>
+      <w:numFmt w:val="bullet"/>
+      <w:lvlText w:val="o"/>
+      <w:lvlJc w:val="left"/>
+      <w:pPr>
+        <w:ind w:left="1800" w:hanging="360"/>
+      </w:pPr>
+      <w:rPr>
+        <w:rFonts w:ascii="Courier New" w:hAnsi="Courier New" w:cs="Courier New" w:hint="default"/>
+      </w:rPr>
+    </w:lvl>
+    <w:lvl w:ilvl="2" w:tplc="280A0005" w:tentative="1">
+      <w:start w:val="1"/>
+      <w:numFmt w:val="bullet"/>
+      <w:lvlText w:val=""/>
+      <w:lvlJc w:val="left"/>
+      <w:pPr>
+        <w:ind w:left="2520" w:hanging="360"/>
+      </w:pPr>
+      <w:rPr>
+        <w:rFonts w:ascii="Wingdings" w:hAnsi="Wingdings" w:hint="default"/>
+      </w:rPr>
+    </w:lvl>
+    <w:lvl w:ilvl="3" w:tplc="280A0001" w:tentative="1">
+      <w:start w:val="1"/>
+      <w:numFmt w:val="bullet"/>
+      <w:lvlText w:val=""/>
+      <w:lvlJc w:val="left"/>
+      <w:pPr>
+        <w:ind w:left="3240" w:hanging="360"/>
+      </w:pPr>
+      <w:rPr>
+        <w:rFonts w:ascii="Symbol" w:hAnsi="Symbol" w:hint="default"/>
+      </w:rPr>
+    </w:lvl>
+    <w:lvl w:ilvl="4" w:tplc="280A0003" w:tentative="1">
+      <w:start w:val="1"/>
+      <w:numFmt w:val="bullet"/>
+      <w:lvlText w:val="o"/>
+      <w:lvlJc w:val="left"/>
+      <w:pPr>
+        <w:ind w:left="3960" w:hanging="360"/>
+      </w:pPr>
+      <w:rPr>
+        <w:rFonts w:ascii="Courier New" w:hAnsi="Courier New" w:cs="Courier New" w:hint="default"/>
+      </w:rPr>
+    </w:lvl>
+    <w:lvl w:ilvl="5" w:tplc="280A0005" w:tentative="1">
+      <w:start w:val="1"/>
+      <w:numFmt w:val="bullet"/>
+      <w:lvlText w:val=""/>
+      <w:lvlJc w:val="left"/>
+      <w:pPr>
+        <w:ind w:left="4680" w:hanging="360"/>
+      </w:pPr>
+      <w:rPr>
+        <w:rFonts w:ascii="Wingdings" w:hAnsi="Wingdings" w:hint="default"/>
+      </w:rPr>
+    </w:lvl>
+    <w:lvl w:ilvl="6" w:tplc="280A0001" w:tentative="1">
+      <w:start w:val="1"/>
+      <w:numFmt w:val="bullet"/>
+      <w:lvlText w:val=""/>
+      <w:lvlJc w:val="left"/>
+      <w:pPr>
+        <w:ind w:left="5400" w:hanging="360"/>
+      </w:pPr>
+      <w:rPr>
+        <w:rFonts w:ascii="Symbol" w:hAnsi="Symbol" w:hint="default"/>
+      </w:rPr>
+    </w:lvl>
+    <w:lvl w:ilvl="7" w:tplc="280A0003" w:tentative="1">
+      <w:start w:val="1"/>
+      <w:numFmt w:val="bullet"/>
+      <w:lvlText w:val="o"/>
+      <w:lvlJc w:val="left"/>
+      <w:pPr>
+        <w:ind w:left="6120" w:hanging="360"/>
+      </w:pPr>
+      <w:rPr>
+        <w:rFonts w:ascii="Courier New" w:hAnsi="Courier New" w:cs="Courier New" w:hint="default"/>
+      </w:rPr>
+    </w:lvl>
+    <w:lvl w:ilvl="8" w:tplc="280A0005" w:tentative="1">
+      <w:start w:val="1"/>
+      <w:numFmt w:val="bullet"/>
+      <w:lvlText w:val=""/>
+      <w:lvlJc w:val="left"/>
+      <w:pPr>
+        <w:ind w:left="6840" w:hanging="360"/>
+      </w:pPr>
+      <w:rPr>
+        <w:rFonts w:ascii="Wingdings" w:hAnsi="Wingdings" w:hint="default"/>
+      </w:rPr>
+    </w:lvl>
+  </w:abstractNum>
   <w:num w:numId="1" w16cid:durableId="56363768">
-    <w:abstractNumId w:val="0"/>
+    <w:abstractNumId w:val="1"/>
   </w:num>
   <w:num w:numId="2" w16cid:durableId="1551114389">
-    <w:abstractNumId w:val="1"/>
+    <w:abstractNumId w:val="2"/>
+  </w:num>
+  <w:num w:numId="3" w16cid:durableId="710769111">
+    <w:abstractNumId w:val="3"/>
+  </w:num>
+  <w:num w:numId="4" w16cid:durableId="2128891532">
+    <w:abstractNumId w:val="0"/>
   </w:num>
 </w:numbering>
 </file>
@@ -1193,6 +2454,7 @@
   <w:style w:type="character" w:default="1" w:styleId="Fuentedeprrafopredeter">
     <w:name w:val="Default Paragraph Font"/>
     <w:uiPriority w:val="1"/>
+    <w:semiHidden/>
     <w:unhideWhenUsed/>
   </w:style>
   <w:style w:type="table" w:default="1" w:styleId="Tablanormal">

</xml_diff>

<commit_message>
Versión 1.2 - Actualización: Ajuste de configuración del agente
</commit_message>
<xml_diff>
--- a/Trabajo Final_Herrera Llanos, Ariany.docx
+++ b/Trabajo Final_Herrera Llanos, Ariany.docx
@@ -10,9 +10,17 @@
           <w:numId w:val="2"/>
         </w:numPr>
         <w:jc w:val="both"/>
+        <w:rPr>
+          <w:b/>
+          <w:bCs/>
+        </w:rPr>
       </w:pPr>
       <w:proofErr w:type="gramStart"/>
       <w:r>
+        <w:rPr>
+          <w:b/>
+          <w:bCs/>
+        </w:rPr>
         <w:t>Problemática a resolver</w:t>
       </w:r>
       <w:proofErr w:type="gramEnd"/>
@@ -221,25 +229,53 @@
           <w:numId w:val="2"/>
         </w:numPr>
         <w:jc w:val="both"/>
-      </w:pPr>
-      <w:r>
+        <w:rPr>
+          <w:b/>
+          <w:bCs/>
+        </w:rPr>
+      </w:pPr>
+      <w:r>
+        <w:rPr>
+          <w:b/>
+          <w:bCs/>
+        </w:rPr>
         <w:t xml:space="preserve">Beneficios de </w:t>
       </w:r>
       <w:r>
+        <w:rPr>
+          <w:b/>
+          <w:bCs/>
+        </w:rPr>
         <w:t>G</w:t>
       </w:r>
       <w:r>
+        <w:rPr>
+          <w:b/>
+          <w:bCs/>
+        </w:rPr>
         <w:t xml:space="preserve">it y </w:t>
       </w:r>
       <w:proofErr w:type="spellStart"/>
       <w:r>
+        <w:rPr>
+          <w:b/>
+          <w:bCs/>
+        </w:rPr>
         <w:t>G</w:t>
       </w:r>
       <w:r>
+        <w:rPr>
+          <w:b/>
+          <w:bCs/>
+        </w:rPr>
         <w:t>ithub</w:t>
       </w:r>
       <w:proofErr w:type="spellEnd"/>
       <w:r>
+        <w:rPr>
+          <w:b/>
+          <w:bCs/>
+        </w:rPr>
         <w:t xml:space="preserve"> ante el problema</w:t>
       </w:r>
     </w:p>
@@ -404,8 +440,16 @@
           <w:numId w:val="2"/>
         </w:numPr>
         <w:jc w:val="both"/>
-      </w:pPr>
-      <w:r>
+        <w:rPr>
+          <w:b/>
+          <w:bCs/>
+        </w:rPr>
+      </w:pPr>
+      <w:r>
+        <w:rPr>
+          <w:b/>
+          <w:bCs/>
+        </w:rPr>
         <w:t>Creación del repositorio</w:t>
       </w:r>
     </w:p>
@@ -652,8 +696,16 @@
           <w:numId w:val="2"/>
         </w:numPr>
         <w:jc w:val="both"/>
-      </w:pPr>
-      <w:r>
+        <w:rPr>
+          <w:b/>
+          <w:bCs/>
+        </w:rPr>
+      </w:pPr>
+      <w:r>
+        <w:rPr>
+          <w:b/>
+          <w:bCs/>
+        </w:rPr>
         <w:t>Creación de ramas</w:t>
       </w:r>
     </w:p>
@@ -661,8 +713,16 @@
       <w:pPr>
         <w:pStyle w:val="Prrafodelista"/>
         <w:jc w:val="both"/>
-      </w:pPr>
-      <w:r>
+        <w:rPr>
+          <w:b/>
+          <w:bCs/>
+        </w:rPr>
+      </w:pPr>
+      <w:r>
+        <w:rPr>
+          <w:b/>
+          <w:bCs/>
+        </w:rPr>
         <w:t>Se creó dos ramas:</w:t>
       </w:r>
     </w:p>
@@ -870,11 +930,14 @@
         <w:pStyle w:val="Prrafodelista"/>
         <w:numPr>
           <w:ilvl w:val="0"/>
-          <w:numId w:val="4"/>
+          <w:numId w:val="3"/>
         </w:numPr>
       </w:pPr>
       <w:r>
-        <w:t>Crear la rama de trabajo</w:t>
+        <w:t>Se creó</w:t>
+      </w:r>
+      <w:r>
+        <w:t xml:space="preserve"> la rama de trabajo</w:t>
       </w:r>
       <w:r>
         <w:t xml:space="preserve"> a partir de </w:t>
@@ -960,7 +1023,7 @@
         <w:pStyle w:val="Prrafodelista"/>
         <w:numPr>
           <w:ilvl w:val="0"/>
-          <w:numId w:val="4"/>
+          <w:numId w:val="3"/>
         </w:numPr>
       </w:pPr>
       <w:r>
@@ -1014,7 +1077,7 @@
         <w:pStyle w:val="Prrafodelista"/>
         <w:numPr>
           <w:ilvl w:val="0"/>
-          <w:numId w:val="4"/>
+          <w:numId w:val="3"/>
         </w:numPr>
       </w:pPr>
       <w:r>
@@ -1079,7 +1142,7 @@
         <w:pStyle w:val="Prrafodelista"/>
         <w:numPr>
           <w:ilvl w:val="0"/>
-          <w:numId w:val="4"/>
+          <w:numId w:val="3"/>
         </w:numPr>
       </w:pPr>
       <w:r>
@@ -1176,7 +1239,7 @@
         <w:pStyle w:val="Prrafodelista"/>
         <w:numPr>
           <w:ilvl w:val="0"/>
-          <w:numId w:val="4"/>
+          <w:numId w:val="3"/>
         </w:numPr>
       </w:pPr>
       <w:r>
@@ -1227,15 +1290,12 @@
         <w:ind w:firstLine="708"/>
       </w:pPr>
       <w:r>
-        <w:rPr>
-          <w:noProof/>
-        </w:rPr>
         <w:lastRenderedPageBreak/>
         <w:drawing>
-          <wp:inline distT="0" distB="0" distL="0" distR="0" wp14:anchorId="66FF0A7E" wp14:editId="4B48CADB">
-            <wp:extent cx="5400040" cy="2334260"/>
-            <wp:effectExtent l="0" t="0" r="0" b="8890"/>
-            <wp:docPr id="551052059" name="Imagen 1"/>
+          <wp:inline distT="0" distB="0" distL="0" distR="0" wp14:anchorId="7B6936CC" wp14:editId="2FAA9EFF">
+            <wp:extent cx="5400040" cy="3089910"/>
+            <wp:effectExtent l="0" t="0" r="0" b="0"/>
+            <wp:docPr id="335470571" name="Imagen 1"/>
             <wp:cNvGraphicFramePr>
               <a:graphicFrameLocks xmlns:a="http://schemas.openxmlformats.org/drawingml/2006/main" noChangeAspect="1"/>
             </wp:cNvGraphicFramePr>
@@ -1243,63 +1303,7 @@
               <a:graphicData uri="http://schemas.openxmlformats.org/drawingml/2006/picture">
                 <pic:pic xmlns:pic="http://schemas.openxmlformats.org/drawingml/2006/picture">
                   <pic:nvPicPr>
-                    <pic:cNvPr id="924432930" name=""/>
-                    <pic:cNvPicPr/>
-                  </pic:nvPicPr>
-                  <pic:blipFill>
-                    <a:blip r:embed="rId9"/>
-                    <a:stretch>
-                      <a:fillRect/>
-                    </a:stretch>
-                  </pic:blipFill>
-                  <pic:spPr>
-                    <a:xfrm>
-                      <a:off x="0" y="0"/>
-                      <a:ext cx="5400040" cy="2334260"/>
-                    </a:xfrm>
-                    <a:prstGeom prst="rect">
-                      <a:avLst/>
-                    </a:prstGeom>
-                  </pic:spPr>
-                </pic:pic>
-              </a:graphicData>
-            </a:graphic>
-          </wp:inline>
-        </w:drawing>
-      </w:r>
-    </w:p>
-    <w:p/>
-    <w:p>
-      <w:pPr>
-        <w:ind w:firstLine="708"/>
-      </w:pPr>
-    </w:p>
-    <w:p>
-      <w:pPr>
-        <w:ind w:firstLine="708"/>
-      </w:pPr>
-    </w:p>
-    <w:p>
-      <w:pPr>
-        <w:ind w:left="708"/>
-      </w:pPr>
-      <w:r>
-        <w:rPr>
-          <w:noProof/>
-        </w:rPr>
-        <w:drawing>
-          <wp:inline distT="0" distB="0" distL="0" distR="0" wp14:anchorId="22D87454" wp14:editId="4BBB7E2B">
-            <wp:extent cx="5400040" cy="2304415"/>
-            <wp:effectExtent l="0" t="0" r="0" b="635"/>
-            <wp:docPr id="1139765395" name="Imagen 1"/>
-            <wp:cNvGraphicFramePr>
-              <a:graphicFrameLocks xmlns:a="http://schemas.openxmlformats.org/drawingml/2006/main" noChangeAspect="1"/>
-            </wp:cNvGraphicFramePr>
-            <a:graphic xmlns:a="http://schemas.openxmlformats.org/drawingml/2006/main">
-              <a:graphicData uri="http://schemas.openxmlformats.org/drawingml/2006/picture">
-                <pic:pic xmlns:pic="http://schemas.openxmlformats.org/drawingml/2006/picture">
-                  <pic:nvPicPr>
-                    <pic:cNvPr id="1139765395" name=""/>
+                    <pic:cNvPr id="335470571" name=""/>
                     <pic:cNvPicPr/>
                   </pic:nvPicPr>
                   <pic:blipFill>
@@ -1311,7 +1315,7 @@
                   <pic:spPr>
                     <a:xfrm>
                       <a:off x="0" y="0"/>
-                      <a:ext cx="5400040" cy="2304415"/>
+                      <a:ext cx="5400040" cy="3089910"/>
                     </a:xfrm>
                     <a:prstGeom prst="rect">
                       <a:avLst/>
@@ -1326,15 +1330,250 @@
     </w:p>
     <w:p>
       <w:pPr>
+        <w:ind w:firstLine="708"/>
+      </w:pPr>
+      <w:r>
+        <w:t xml:space="preserve">Evidencia de </w:t>
+      </w:r>
+      <w:proofErr w:type="spellStart"/>
+      <w:r>
+        <w:t>commits</w:t>
+      </w:r>
+      <w:proofErr w:type="spellEnd"/>
+    </w:p>
+    <w:p>
+      <w:pPr>
+        <w:ind w:firstLine="708"/>
+      </w:pPr>
+      <w:r>
+        <w:drawing>
+          <wp:inline distT="0" distB="0" distL="0" distR="0" wp14:anchorId="4650DFA7" wp14:editId="0CE66C7F">
+            <wp:extent cx="5400040" cy="1386205"/>
+            <wp:effectExtent l="0" t="0" r="0" b="4445"/>
+            <wp:docPr id="1925101066" name="Imagen 1"/>
+            <wp:cNvGraphicFramePr>
+              <a:graphicFrameLocks xmlns:a="http://schemas.openxmlformats.org/drawingml/2006/main" noChangeAspect="1"/>
+            </wp:cNvGraphicFramePr>
+            <a:graphic xmlns:a="http://schemas.openxmlformats.org/drawingml/2006/main">
+              <a:graphicData uri="http://schemas.openxmlformats.org/drawingml/2006/picture">
+                <pic:pic xmlns:pic="http://schemas.openxmlformats.org/drawingml/2006/picture">
+                  <pic:nvPicPr>
+                    <pic:cNvPr id="1925101066" name=""/>
+                    <pic:cNvPicPr/>
+                  </pic:nvPicPr>
+                  <pic:blipFill>
+                    <a:blip r:embed="rId11"/>
+                    <a:stretch>
+                      <a:fillRect/>
+                    </a:stretch>
+                  </pic:blipFill>
+                  <pic:spPr>
+                    <a:xfrm>
+                      <a:off x="0" y="0"/>
+                      <a:ext cx="5400040" cy="1386205"/>
+                    </a:xfrm>
+                    <a:prstGeom prst="rect">
+                      <a:avLst/>
+                    </a:prstGeom>
+                  </pic:spPr>
+                </pic:pic>
+              </a:graphicData>
+            </a:graphic>
+          </wp:inline>
+        </w:drawing>
+      </w:r>
+    </w:p>
+    <w:p>
+      <w:pPr>
+        <w:ind w:left="708"/>
+      </w:pPr>
+    </w:p>
+    <w:p>
+      <w:pPr>
         <w:pStyle w:val="Prrafodelista"/>
         <w:numPr>
           <w:ilvl w:val="0"/>
           <w:numId w:val="2"/>
         </w:numPr>
-      </w:pPr>
-      <w:r>
-        <w:t>Despliegue y control de versiones</w:t>
-      </w:r>
+        <w:rPr>
+          <w:b/>
+          <w:bCs/>
+        </w:rPr>
+      </w:pPr>
+      <w:r>
+        <w:rPr>
+          <w:b/>
+          <w:bCs/>
+        </w:rPr>
+        <w:t>Despliegue y Control de Versiones</w:t>
+      </w:r>
+    </w:p>
+    <w:p>
+      <w:pPr>
+        <w:ind w:left="708"/>
+      </w:pPr>
+      <w:r>
+        <w:t xml:space="preserve">Después de creadas las ramas, se registró los cambios del pipeline mediante </w:t>
+      </w:r>
+      <w:proofErr w:type="spellStart"/>
+      <w:r>
+        <w:t>commits</w:t>
+      </w:r>
+      <w:proofErr w:type="spellEnd"/>
+      <w:r>
+        <w:t xml:space="preserve">, </w:t>
+      </w:r>
+      <w:r>
+        <w:t xml:space="preserve">donde se podrá ver </w:t>
+      </w:r>
+      <w:r>
+        <w:t>el historial de versiones.</w:t>
+      </w:r>
+      <w:r>
+        <w:t xml:space="preserve"> Aquí se dará </w:t>
+      </w:r>
+      <w:proofErr w:type="spellStart"/>
+      <w:proofErr w:type="gramStart"/>
+      <w:r>
+        <w:t>click</w:t>
+      </w:r>
+      <w:proofErr w:type="spellEnd"/>
+      <w:proofErr w:type="gramEnd"/>
+      <w:r>
+        <w:t xml:space="preserve"> para ver quien identificar en todo momento qué se modificó.</w:t>
+      </w:r>
+    </w:p>
+    <w:p>
+      <w:pPr>
+        <w:ind w:firstLine="708"/>
+      </w:pPr>
+      <w:r>
+        <w:lastRenderedPageBreak/>
+        <w:drawing>
+          <wp:inline distT="0" distB="0" distL="0" distR="0" wp14:anchorId="47066C23" wp14:editId="0413EB00">
+            <wp:extent cx="5400040" cy="2487930"/>
+            <wp:effectExtent l="0" t="0" r="0" b="7620"/>
+            <wp:docPr id="1377139972" name="Imagen 1"/>
+            <wp:cNvGraphicFramePr>
+              <a:graphicFrameLocks xmlns:a="http://schemas.openxmlformats.org/drawingml/2006/main" noChangeAspect="1"/>
+            </wp:cNvGraphicFramePr>
+            <a:graphic xmlns:a="http://schemas.openxmlformats.org/drawingml/2006/main">
+              <a:graphicData uri="http://schemas.openxmlformats.org/drawingml/2006/picture">
+                <pic:pic xmlns:pic="http://schemas.openxmlformats.org/drawingml/2006/picture">
+                  <pic:nvPicPr>
+                    <pic:cNvPr id="1377139972" name=""/>
+                    <pic:cNvPicPr/>
+                  </pic:nvPicPr>
+                  <pic:blipFill>
+                    <a:blip r:embed="rId12"/>
+                    <a:stretch>
+                      <a:fillRect/>
+                    </a:stretch>
+                  </pic:blipFill>
+                  <pic:spPr>
+                    <a:xfrm>
+                      <a:off x="0" y="0"/>
+                      <a:ext cx="5400040" cy="2487930"/>
+                    </a:xfrm>
+                    <a:prstGeom prst="rect">
+                      <a:avLst/>
+                    </a:prstGeom>
+                  </pic:spPr>
+                </pic:pic>
+              </a:graphicData>
+            </a:graphic>
+          </wp:inline>
+        </w:drawing>
+      </w:r>
+    </w:p>
+    <w:p>
+      <w:pPr>
+        <w:ind w:firstLine="708"/>
+      </w:pPr>
+      <w:r>
+        <w:drawing>
+          <wp:inline distT="0" distB="0" distL="0" distR="0" wp14:anchorId="3DCF37BF" wp14:editId="1151630A">
+            <wp:extent cx="5400040" cy="1386205"/>
+            <wp:effectExtent l="0" t="0" r="0" b="4445"/>
+            <wp:docPr id="1409838759" name="Imagen 1"/>
+            <wp:cNvGraphicFramePr>
+              <a:graphicFrameLocks xmlns:a="http://schemas.openxmlformats.org/drawingml/2006/main" noChangeAspect="1"/>
+            </wp:cNvGraphicFramePr>
+            <a:graphic xmlns:a="http://schemas.openxmlformats.org/drawingml/2006/main">
+              <a:graphicData uri="http://schemas.openxmlformats.org/drawingml/2006/picture">
+                <pic:pic xmlns:pic="http://schemas.openxmlformats.org/drawingml/2006/picture">
+                  <pic:nvPicPr>
+                    <pic:cNvPr id="1925101066" name=""/>
+                    <pic:cNvPicPr/>
+                  </pic:nvPicPr>
+                  <pic:blipFill>
+                    <a:blip r:embed="rId11"/>
+                    <a:stretch>
+                      <a:fillRect/>
+                    </a:stretch>
+                  </pic:blipFill>
+                  <pic:spPr>
+                    <a:xfrm>
+                      <a:off x="0" y="0"/>
+                      <a:ext cx="5400040" cy="1386205"/>
+                    </a:xfrm>
+                    <a:prstGeom prst="rect">
+                      <a:avLst/>
+                    </a:prstGeom>
+                  </pic:spPr>
+                </pic:pic>
+              </a:graphicData>
+            </a:graphic>
+          </wp:inline>
+        </w:drawing>
+      </w:r>
+    </w:p>
+    <w:p>
+      <w:pPr>
+        <w:ind w:firstLine="708"/>
+      </w:pPr>
+      <w:r>
+        <w:drawing>
+          <wp:inline distT="0" distB="0" distL="0" distR="0" wp14:anchorId="18D0281A" wp14:editId="7D5B7FDF">
+            <wp:extent cx="5400040" cy="1739265"/>
+            <wp:effectExtent l="0" t="0" r="0" b="0"/>
+            <wp:docPr id="1976975678" name="Imagen 1"/>
+            <wp:cNvGraphicFramePr>
+              <a:graphicFrameLocks xmlns:a="http://schemas.openxmlformats.org/drawingml/2006/main" noChangeAspect="1"/>
+            </wp:cNvGraphicFramePr>
+            <a:graphic xmlns:a="http://schemas.openxmlformats.org/drawingml/2006/main">
+              <a:graphicData uri="http://schemas.openxmlformats.org/drawingml/2006/picture">
+                <pic:pic xmlns:pic="http://schemas.openxmlformats.org/drawingml/2006/picture">
+                  <pic:nvPicPr>
+                    <pic:cNvPr id="1976975678" name=""/>
+                    <pic:cNvPicPr/>
+                  </pic:nvPicPr>
+                  <pic:blipFill>
+                    <a:blip r:embed="rId13"/>
+                    <a:stretch>
+                      <a:fillRect/>
+                    </a:stretch>
+                  </pic:blipFill>
+                  <pic:spPr>
+                    <a:xfrm>
+                      <a:off x="0" y="0"/>
+                      <a:ext cx="5400040" cy="1739265"/>
+                    </a:xfrm>
+                    <a:prstGeom prst="rect">
+                      <a:avLst/>
+                    </a:prstGeom>
+                  </pic:spPr>
+                </pic:pic>
+              </a:graphicData>
+            </a:graphic>
+          </wp:inline>
+        </w:drawing>
+      </w:r>
+    </w:p>
+    <w:p>
+      <w:pPr>
+        <w:pStyle w:val="Prrafodelista"/>
+      </w:pPr>
     </w:p>
     <w:p>
       <w:pPr>
@@ -1343,9 +1582,33 @@
           <w:ilvl w:val="0"/>
           <w:numId w:val="2"/>
         </w:numPr>
-      </w:pPr>
-      <w:r>
-        <w:t>Documentación (Opcional)</w:t>
+        <w:rPr>
+          <w:b/>
+          <w:bCs/>
+        </w:rPr>
+      </w:pPr>
+      <w:r>
+        <w:rPr>
+          <w:b/>
+          <w:bCs/>
+        </w:rPr>
+        <w:t>Conclusiones y Recomendaciones</w:t>
+      </w:r>
+    </w:p>
+    <w:p>
+      <w:pPr>
+        <w:ind w:left="708"/>
+        <w:rPr>
+          <w:b/>
+          <w:bCs/>
+        </w:rPr>
+      </w:pPr>
+      <w:r>
+        <w:rPr>
+          <w:b/>
+          <w:bCs/>
+        </w:rPr>
+        <w:t>Conclusiones:</w:t>
       </w:r>
     </w:p>
     <w:p>
@@ -1353,12 +1616,98 @@
         <w:pStyle w:val="Prrafodelista"/>
         <w:numPr>
           <w:ilvl w:val="0"/>
-          <w:numId w:val="2"/>
+          <w:numId w:val="3"/>
         </w:numPr>
       </w:pPr>
       <w:r>
-        <w:t>Conclusiones y Recomendaciones</w:t>
-      </w:r>
+        <w:t xml:space="preserve">Al implementar el Git y el GitHub nos ayudó a contar con </w:t>
+      </w:r>
+      <w:r>
+        <w:t xml:space="preserve">la pérdida de historial de cambios que se puedan dar, renombramiento de archivos </w:t>
+      </w:r>
+      <w:r>
+        <w:t xml:space="preserve">y la </w:t>
+      </w:r>
+      <w:r>
+        <w:t>sobre escritorio</w:t>
+      </w:r>
+      <w:r>
+        <w:t xml:space="preserve"> de modificaciones entre los integrantes.</w:t>
+      </w:r>
+    </w:p>
+    <w:p>
+      <w:pPr>
+        <w:pStyle w:val="Prrafodelista"/>
+        <w:numPr>
+          <w:ilvl w:val="0"/>
+          <w:numId w:val="3"/>
+        </w:numPr>
+      </w:pPr>
+      <w:r>
+        <w:t>Las ramas aisladas ayudaron a que se pueda trabajar de manera independiente</w:t>
+      </w:r>
+      <w:r>
+        <w:t xml:space="preserve"> y estable, ya que no afecta el </w:t>
+      </w:r>
+      <w:r>
+        <w:t>código</w:t>
+      </w:r>
+      <w:r>
+        <w:t xml:space="preserve"> estable de la rama.</w:t>
+      </w:r>
+    </w:p>
+    <w:p>
+      <w:pPr>
+        <w:pStyle w:val="Prrafodelista"/>
+        <w:numPr>
+          <w:ilvl w:val="0"/>
+          <w:numId w:val="3"/>
+        </w:numPr>
+      </w:pPr>
+      <w:r>
+        <w:t xml:space="preserve">Las versiones nos </w:t>
+      </w:r>
+      <w:r>
+        <w:t>ayudarán</w:t>
+      </w:r>
+      <w:r>
+        <w:t xml:space="preserve"> también a auditar internamente el proceso y saber </w:t>
+      </w:r>
+      <w:r>
+        <w:t>quién</w:t>
+      </w:r>
+      <w:r>
+        <w:t xml:space="preserve"> fue y cuando.</w:t>
+      </w:r>
+    </w:p>
+    <w:p>
+      <w:pPr>
+        <w:ind w:left="720"/>
+        <w:rPr>
+          <w:b/>
+          <w:bCs/>
+        </w:rPr>
+      </w:pPr>
+      <w:r>
+        <w:rPr>
+          <w:b/>
+          <w:bCs/>
+        </w:rPr>
+        <w:t>Recomendaciones:</w:t>
+      </w:r>
+    </w:p>
+    <w:p>
+      <w:pPr>
+        <w:pStyle w:val="Prrafodelista"/>
+        <w:numPr>
+          <w:ilvl w:val="0"/>
+          <w:numId w:val="3"/>
+        </w:numPr>
+        <w:rPr>
+          <w:b/>
+          <w:bCs/>
+        </w:rPr>
+      </w:pPr>
     </w:p>
     <w:sectPr>
       <w:pgSz w:w="11906" w:h="16838"/>
@@ -1390,7 +1739,7 @@
         <w:bCs w:val="0"/>
       </w:rPr>
     </w:lvl>
-    <w:lvl w:ilvl="1" w:tplc="280A0019" w:tentative="1">
+    <w:lvl w:ilvl="1" w:tplc="280A0019">
       <w:start w:val="1"/>
       <w:numFmt w:val="lowerLetter"/>
       <w:lvlText w:val="%2."/>
@@ -2454,7 +2803,6 @@
   <w:style w:type="character" w:default="1" w:styleId="Fuentedeprrafopredeter">
     <w:name w:val="Default Paragraph Font"/>
     <w:uiPriority w:val="1"/>
-    <w:semiHidden/>
     <w:unhideWhenUsed/>
   </w:style>
   <w:style w:type="table" w:default="1" w:styleId="Tablanormal">

</xml_diff>